<commit_message>
feat: add new functionality for managing lot shipment status with enhanced data handling and export capabilities
</commit_message>
<xml_diff>
--- a/templates/label_fair.docx
+++ b/templates/label_fair.docx
@@ -36,7 +36,7 @@
           </w:tcPr>
           <w:p>
             <w:pPr>
-              <w:spacing w:before="120" w:after="0" w:line="240" w:lineRule="auto"/>
+              <w:spacing w:after="0" w:line="240" w:lineRule="auto"/>
               <w:ind w:left="101" w:right="101"/>
               <w:rPr>
                 <w:rFonts w:ascii="Arial Narrow" w:hAnsi="Arial Narrow"/>
@@ -68,18 +68,6 @@
               </w:rPr>
               <w:t xml:space="preserve">           </w:t>
             </w:r>
-          </w:p>
-          <w:p>
-            <w:pPr>
-              <w:spacing w:after="0" w:line="240" w:lineRule="auto"/>
-              <w:ind w:left="106" w:right="106"/>
-              <w:jc w:val="center"/>
-              <w:rPr>
-                <w:rFonts w:ascii="Arial Narrow" w:hAnsi="Arial Narrow"/>
-                <w:sz w:val="6"/>
-                <w:szCs w:val="6"/>
-              </w:rPr>
-            </w:pPr>
           </w:p>
           <w:p>
             <w:pPr>
@@ -243,7 +231,7 @@
           </w:tcPr>
           <w:p>
             <w:pPr>
-              <w:spacing w:before="120" w:after="0" w:line="240" w:lineRule="auto"/>
+              <w:spacing w:after="0" w:line="240" w:lineRule="auto"/>
               <w:ind w:left="101" w:right="101"/>
               <w:rPr>
                 <w:rFonts w:ascii="Arial Narrow" w:hAnsi="Arial Narrow"/>
@@ -275,18 +263,6 @@
               </w:rPr>
               <w:t xml:space="preserve">           </w:t>
             </w:r>
-          </w:p>
-          <w:p>
-            <w:pPr>
-              <w:spacing w:after="0" w:line="240" w:lineRule="auto"/>
-              <w:ind w:left="106" w:right="106"/>
-              <w:jc w:val="center"/>
-              <w:rPr>
-                <w:rFonts w:ascii="Arial Narrow" w:hAnsi="Arial Narrow"/>
-                <w:sz w:val="6"/>
-                <w:szCs w:val="6"/>
-              </w:rPr>
-            </w:pPr>
           </w:p>
           <w:p>
             <w:pPr>
@@ -449,7 +425,7 @@
           </w:tcPr>
           <w:p>
             <w:pPr>
-              <w:spacing w:before="120" w:after="0" w:line="240" w:lineRule="auto"/>
+              <w:spacing w:after="0" w:line="240" w:lineRule="auto"/>
               <w:ind w:left="101" w:right="101"/>
               <w:rPr>
                 <w:rFonts w:ascii="Arial Narrow" w:hAnsi="Arial Narrow"/>
@@ -481,18 +457,6 @@
               </w:rPr>
               <w:t xml:space="preserve">           </w:t>
             </w:r>
-          </w:p>
-          <w:p>
-            <w:pPr>
-              <w:spacing w:after="0" w:line="240" w:lineRule="auto"/>
-              <w:ind w:left="106" w:right="106"/>
-              <w:jc w:val="center"/>
-              <w:rPr>
-                <w:rFonts w:ascii="Arial Narrow" w:hAnsi="Arial Narrow"/>
-                <w:sz w:val="6"/>
-                <w:szCs w:val="6"/>
-              </w:rPr>
-            </w:pPr>
           </w:p>
           <w:p>
             <w:pPr>
@@ -718,7 +682,7 @@
           </w:tcPr>
           <w:p>
             <w:pPr>
-              <w:spacing w:before="120" w:after="0" w:line="240" w:lineRule="auto"/>
+              <w:spacing w:after="0" w:line="240" w:lineRule="auto"/>
               <w:ind w:left="101" w:right="101"/>
               <w:rPr>
                 <w:rFonts w:ascii="Arial Narrow" w:hAnsi="Arial Narrow"/>
@@ -750,18 +714,6 @@
               </w:rPr>
               <w:t xml:space="preserve">           </w:t>
             </w:r>
-          </w:p>
-          <w:p>
-            <w:pPr>
-              <w:spacing w:after="0" w:line="240" w:lineRule="auto"/>
-              <w:ind w:left="106" w:right="106"/>
-              <w:jc w:val="center"/>
-              <w:rPr>
-                <w:rFonts w:ascii="Arial Narrow" w:hAnsi="Arial Narrow"/>
-                <w:sz w:val="6"/>
-                <w:szCs w:val="6"/>
-              </w:rPr>
-            </w:pPr>
           </w:p>
           <w:p>
             <w:pPr>
@@ -925,7 +877,7 @@
           </w:tcPr>
           <w:p>
             <w:pPr>
-              <w:spacing w:before="120" w:after="0" w:line="240" w:lineRule="auto"/>
+              <w:spacing w:after="0" w:line="240" w:lineRule="auto"/>
               <w:ind w:left="101" w:right="101"/>
               <w:rPr>
                 <w:rFonts w:ascii="Arial Narrow" w:hAnsi="Arial Narrow"/>
@@ -957,18 +909,6 @@
               </w:rPr>
               <w:t xml:space="preserve">           </w:t>
             </w:r>
-          </w:p>
-          <w:p>
-            <w:pPr>
-              <w:spacing w:after="0" w:line="240" w:lineRule="auto"/>
-              <w:ind w:left="106" w:right="106"/>
-              <w:jc w:val="center"/>
-              <w:rPr>
-                <w:rFonts w:ascii="Arial Narrow" w:hAnsi="Arial Narrow"/>
-                <w:sz w:val="6"/>
-                <w:szCs w:val="6"/>
-              </w:rPr>
-            </w:pPr>
           </w:p>
           <w:p>
             <w:pPr>
@@ -1131,7 +1071,7 @@
           </w:tcPr>
           <w:p>
             <w:pPr>
-              <w:spacing w:before="120" w:after="0" w:line="240" w:lineRule="auto"/>
+              <w:spacing w:after="0" w:line="240" w:lineRule="auto"/>
               <w:ind w:left="101" w:right="101"/>
               <w:rPr>
                 <w:rFonts w:ascii="Arial Narrow" w:hAnsi="Arial Narrow"/>
@@ -1163,18 +1103,6 @@
               </w:rPr>
               <w:t xml:space="preserve">           </w:t>
             </w:r>
-          </w:p>
-          <w:p>
-            <w:pPr>
-              <w:spacing w:after="0" w:line="240" w:lineRule="auto"/>
-              <w:ind w:left="106" w:right="106"/>
-              <w:jc w:val="center"/>
-              <w:rPr>
-                <w:rFonts w:ascii="Arial Narrow" w:hAnsi="Arial Narrow"/>
-                <w:sz w:val="6"/>
-                <w:szCs w:val="6"/>
-              </w:rPr>
-            </w:pPr>
           </w:p>
           <w:p>
             <w:pPr>
@@ -1320,7 +1248,7 @@
           </w:tcPr>
           <w:p>
             <w:pPr>
-              <w:spacing w:before="120" w:after="0" w:line="240" w:lineRule="auto"/>
+              <w:spacing w:after="0" w:line="240" w:lineRule="auto"/>
               <w:ind w:left="101" w:right="101"/>
               <w:rPr>
                 <w:rFonts w:ascii="Arial Narrow" w:hAnsi="Arial Narrow"/>
@@ -1352,18 +1280,6 @@
               </w:rPr>
               <w:t xml:space="preserve">           </w:t>
             </w:r>
-          </w:p>
-          <w:p>
-            <w:pPr>
-              <w:spacing w:after="0" w:line="240" w:lineRule="auto"/>
-              <w:ind w:left="106" w:right="106"/>
-              <w:jc w:val="center"/>
-              <w:rPr>
-                <w:rFonts w:ascii="Arial Narrow" w:hAnsi="Arial Narrow"/>
-                <w:sz w:val="6"/>
-                <w:szCs w:val="6"/>
-              </w:rPr>
-            </w:pPr>
           </w:p>
           <w:p>
             <w:pPr>
@@ -1527,7 +1443,7 @@
           </w:tcPr>
           <w:p>
             <w:pPr>
-              <w:spacing w:before="120" w:after="0" w:line="240" w:lineRule="auto"/>
+              <w:spacing w:after="0" w:line="240" w:lineRule="auto"/>
               <w:ind w:left="101" w:right="101"/>
               <w:rPr>
                 <w:rFonts w:ascii="Arial Narrow" w:hAnsi="Arial Narrow"/>
@@ -1559,18 +1475,6 @@
               </w:rPr>
               <w:t xml:space="preserve">           </w:t>
             </w:r>
-          </w:p>
-          <w:p>
-            <w:pPr>
-              <w:spacing w:after="0" w:line="240" w:lineRule="auto"/>
-              <w:ind w:left="106" w:right="106"/>
-              <w:jc w:val="center"/>
-              <w:rPr>
-                <w:rFonts w:ascii="Arial Narrow" w:hAnsi="Arial Narrow"/>
-                <w:sz w:val="6"/>
-                <w:szCs w:val="6"/>
-              </w:rPr>
-            </w:pPr>
           </w:p>
           <w:p>
             <w:pPr>
@@ -1733,7 +1637,7 @@
           </w:tcPr>
           <w:p>
             <w:pPr>
-              <w:spacing w:before="120" w:after="0" w:line="240" w:lineRule="auto"/>
+              <w:spacing w:after="0" w:line="240" w:lineRule="auto"/>
               <w:ind w:left="101" w:right="101"/>
               <w:rPr>
                 <w:rFonts w:ascii="Arial Narrow" w:hAnsi="Arial Narrow"/>
@@ -1765,18 +1669,6 @@
               </w:rPr>
               <w:t xml:space="preserve">           </w:t>
             </w:r>
-          </w:p>
-          <w:p>
-            <w:pPr>
-              <w:spacing w:after="0" w:line="240" w:lineRule="auto"/>
-              <w:ind w:left="106" w:right="106"/>
-              <w:jc w:val="center"/>
-              <w:rPr>
-                <w:rFonts w:ascii="Arial Narrow" w:hAnsi="Arial Narrow"/>
-                <w:sz w:val="6"/>
-                <w:szCs w:val="6"/>
-              </w:rPr>
-            </w:pPr>
           </w:p>
           <w:p>
             <w:pPr>
@@ -1922,7 +1814,7 @@
           </w:tcPr>
           <w:p>
             <w:pPr>
-              <w:spacing w:before="120" w:after="0" w:line="240" w:lineRule="auto"/>
+              <w:spacing w:after="0" w:line="240" w:lineRule="auto"/>
               <w:ind w:left="101" w:right="101"/>
               <w:rPr>
                 <w:rFonts w:ascii="Arial Narrow" w:hAnsi="Arial Narrow"/>
@@ -1954,18 +1846,6 @@
               </w:rPr>
               <w:t xml:space="preserve">           </w:t>
             </w:r>
-          </w:p>
-          <w:p>
-            <w:pPr>
-              <w:spacing w:after="0" w:line="240" w:lineRule="auto"/>
-              <w:ind w:left="106" w:right="106"/>
-              <w:jc w:val="center"/>
-              <w:rPr>
-                <w:rFonts w:ascii="Arial Narrow" w:hAnsi="Arial Narrow"/>
-                <w:sz w:val="6"/>
-                <w:szCs w:val="6"/>
-              </w:rPr>
-            </w:pPr>
           </w:p>
           <w:p>
             <w:pPr>
@@ -2129,7 +2009,7 @@
           </w:tcPr>
           <w:p>
             <w:pPr>
-              <w:spacing w:before="120" w:after="0" w:line="240" w:lineRule="auto"/>
+              <w:spacing w:after="0" w:line="240" w:lineRule="auto"/>
               <w:ind w:left="101" w:right="101"/>
               <w:rPr>
                 <w:rFonts w:ascii="Arial Narrow" w:hAnsi="Arial Narrow"/>
@@ -2161,18 +2041,6 @@
               </w:rPr>
               <w:t xml:space="preserve">           </w:t>
             </w:r>
-          </w:p>
-          <w:p>
-            <w:pPr>
-              <w:spacing w:after="0" w:line="240" w:lineRule="auto"/>
-              <w:ind w:left="106" w:right="106"/>
-              <w:jc w:val="center"/>
-              <w:rPr>
-                <w:rFonts w:ascii="Arial Narrow" w:hAnsi="Arial Narrow"/>
-                <w:sz w:val="6"/>
-                <w:szCs w:val="6"/>
-              </w:rPr>
-            </w:pPr>
           </w:p>
           <w:p>
             <w:pPr>
@@ -2338,7 +2206,7 @@
           </w:tcPr>
           <w:p>
             <w:pPr>
-              <w:spacing w:before="120" w:after="0" w:line="240" w:lineRule="auto"/>
+              <w:spacing w:after="0" w:line="240" w:lineRule="auto"/>
               <w:ind w:left="101" w:right="101"/>
               <w:rPr>
                 <w:rFonts w:ascii="Arial Narrow" w:hAnsi="Arial Narrow"/>
@@ -2370,18 +2238,6 @@
               </w:rPr>
               <w:t xml:space="preserve">           </w:t>
             </w:r>
-          </w:p>
-          <w:p>
-            <w:pPr>
-              <w:spacing w:after="0" w:line="240" w:lineRule="auto"/>
-              <w:ind w:left="106" w:right="106"/>
-              <w:jc w:val="center"/>
-              <w:rPr>
-                <w:rFonts w:ascii="Arial Narrow" w:hAnsi="Arial Narrow"/>
-                <w:sz w:val="6"/>
-                <w:szCs w:val="6"/>
-              </w:rPr>
-            </w:pPr>
           </w:p>
           <w:p>
             <w:pPr>
@@ -2527,7 +2383,7 @@
           </w:tcPr>
           <w:p>
             <w:pPr>
-              <w:spacing w:before="120" w:after="0" w:line="240" w:lineRule="auto"/>
+              <w:spacing w:after="0" w:line="240" w:lineRule="auto"/>
               <w:ind w:left="101" w:right="101"/>
               <w:rPr>
                 <w:rFonts w:ascii="Arial Narrow" w:hAnsi="Arial Narrow"/>
@@ -2559,18 +2415,6 @@
               </w:rPr>
               <w:t xml:space="preserve">           </w:t>
             </w:r>
-          </w:p>
-          <w:p>
-            <w:pPr>
-              <w:spacing w:after="0" w:line="240" w:lineRule="auto"/>
-              <w:ind w:left="106" w:right="106"/>
-              <w:jc w:val="center"/>
-              <w:rPr>
-                <w:rFonts w:ascii="Arial Narrow" w:hAnsi="Arial Narrow"/>
-                <w:sz w:val="6"/>
-                <w:szCs w:val="6"/>
-              </w:rPr>
-            </w:pPr>
           </w:p>
           <w:p>
             <w:pPr>
@@ -2733,7 +2577,7 @@
           </w:tcPr>
           <w:p>
             <w:pPr>
-              <w:spacing w:before="120" w:after="0" w:line="240" w:lineRule="auto"/>
+              <w:spacing w:after="0" w:line="240" w:lineRule="auto"/>
               <w:ind w:left="101" w:right="101"/>
               <w:rPr>
                 <w:rFonts w:ascii="Arial Narrow" w:hAnsi="Arial Narrow"/>
@@ -2765,18 +2609,6 @@
               </w:rPr>
               <w:t xml:space="preserve">           </w:t>
             </w:r>
-          </w:p>
-          <w:p>
-            <w:pPr>
-              <w:spacing w:after="0" w:line="240" w:lineRule="auto"/>
-              <w:ind w:left="106" w:right="106"/>
-              <w:jc w:val="center"/>
-              <w:rPr>
-                <w:rFonts w:ascii="Arial Narrow" w:hAnsi="Arial Narrow"/>
-                <w:sz w:val="6"/>
-                <w:szCs w:val="6"/>
-              </w:rPr>
-            </w:pPr>
           </w:p>
           <w:p>
             <w:pPr>
@@ -2939,7 +2771,7 @@
           </w:tcPr>
           <w:p>
             <w:pPr>
-              <w:spacing w:before="120" w:after="0" w:line="240" w:lineRule="auto"/>
+              <w:spacing w:after="0" w:line="240" w:lineRule="auto"/>
               <w:ind w:left="101" w:right="101"/>
               <w:rPr>
                 <w:rFonts w:ascii="Arial Narrow" w:hAnsi="Arial Narrow"/>
@@ -2971,18 +2803,6 @@
               </w:rPr>
               <w:t xml:space="preserve">           </w:t>
             </w:r>
-          </w:p>
-          <w:p>
-            <w:pPr>
-              <w:spacing w:after="0" w:line="240" w:lineRule="auto"/>
-              <w:ind w:left="106" w:right="106"/>
-              <w:jc w:val="center"/>
-              <w:rPr>
-                <w:rFonts w:ascii="Arial Narrow" w:hAnsi="Arial Narrow"/>
-                <w:sz w:val="6"/>
-                <w:szCs w:val="6"/>
-              </w:rPr>
-            </w:pPr>
           </w:p>
           <w:p>
             <w:pPr>
@@ -3128,7 +2948,7 @@
           </w:tcPr>
           <w:p>
             <w:pPr>
-              <w:spacing w:before="120" w:after="0" w:line="240" w:lineRule="auto"/>
+              <w:spacing w:after="0" w:line="240" w:lineRule="auto"/>
               <w:ind w:left="101" w:right="101"/>
               <w:rPr>
                 <w:rFonts w:ascii="Arial Narrow" w:hAnsi="Arial Narrow"/>
@@ -3160,18 +2980,6 @@
               </w:rPr>
               <w:t xml:space="preserve">           </w:t>
             </w:r>
-          </w:p>
-          <w:p>
-            <w:pPr>
-              <w:spacing w:after="0" w:line="240" w:lineRule="auto"/>
-              <w:ind w:left="106" w:right="106"/>
-              <w:jc w:val="center"/>
-              <w:rPr>
-                <w:rFonts w:ascii="Arial Narrow" w:hAnsi="Arial Narrow"/>
-                <w:sz w:val="6"/>
-                <w:szCs w:val="6"/>
-              </w:rPr>
-            </w:pPr>
           </w:p>
           <w:p>
             <w:pPr>
@@ -3334,7 +3142,7 @@
           </w:tcPr>
           <w:p>
             <w:pPr>
-              <w:spacing w:before="120" w:after="0" w:line="240" w:lineRule="auto"/>
+              <w:spacing w:after="0" w:line="240" w:lineRule="auto"/>
               <w:ind w:left="101" w:right="101"/>
               <w:rPr>
                 <w:rFonts w:ascii="Arial Narrow" w:hAnsi="Arial Narrow"/>
@@ -3366,18 +3174,6 @@
               </w:rPr>
               <w:t xml:space="preserve">           </w:t>
             </w:r>
-          </w:p>
-          <w:p>
-            <w:pPr>
-              <w:spacing w:after="0" w:line="240" w:lineRule="auto"/>
-              <w:ind w:left="106" w:right="106"/>
-              <w:jc w:val="center"/>
-              <w:rPr>
-                <w:rFonts w:ascii="Arial Narrow" w:hAnsi="Arial Narrow"/>
-                <w:sz w:val="6"/>
-                <w:szCs w:val="6"/>
-              </w:rPr>
-            </w:pPr>
           </w:p>
           <w:p>
             <w:pPr>
@@ -3540,7 +3336,7 @@
           </w:tcPr>
           <w:p>
             <w:pPr>
-              <w:spacing w:before="120" w:after="0" w:line="240" w:lineRule="auto"/>
+              <w:spacing w:after="0" w:line="240" w:lineRule="auto"/>
               <w:ind w:left="101" w:right="101"/>
               <w:rPr>
                 <w:rFonts w:ascii="Arial Narrow" w:hAnsi="Arial Narrow"/>
@@ -3572,18 +3368,6 @@
               </w:rPr>
               <w:t xml:space="preserve">           </w:t>
             </w:r>
-          </w:p>
-          <w:p>
-            <w:pPr>
-              <w:spacing w:after="0" w:line="240" w:lineRule="auto"/>
-              <w:ind w:left="106" w:right="106"/>
-              <w:jc w:val="center"/>
-              <w:rPr>
-                <w:rFonts w:ascii="Arial Narrow" w:hAnsi="Arial Narrow"/>
-                <w:sz w:val="6"/>
-                <w:szCs w:val="6"/>
-              </w:rPr>
-            </w:pPr>
           </w:p>
           <w:p>
             <w:pPr>
@@ -3729,7 +3513,7 @@
           </w:tcPr>
           <w:p>
             <w:pPr>
-              <w:spacing w:before="120" w:after="0" w:line="240" w:lineRule="auto"/>
+              <w:spacing w:after="0" w:line="240" w:lineRule="auto"/>
               <w:ind w:left="101" w:right="101"/>
               <w:rPr>
                 <w:rFonts w:ascii="Arial Narrow" w:hAnsi="Arial Narrow"/>
@@ -3761,18 +3545,6 @@
               </w:rPr>
               <w:t xml:space="preserve">           </w:t>
             </w:r>
-          </w:p>
-          <w:p>
-            <w:pPr>
-              <w:spacing w:after="0" w:line="240" w:lineRule="auto"/>
-              <w:ind w:left="106" w:right="106"/>
-              <w:jc w:val="center"/>
-              <w:rPr>
-                <w:rFonts w:ascii="Arial Narrow" w:hAnsi="Arial Narrow"/>
-                <w:sz w:val="6"/>
-                <w:szCs w:val="6"/>
-              </w:rPr>
-            </w:pPr>
           </w:p>
           <w:p>
             <w:pPr>
@@ -3935,7 +3707,7 @@
           </w:tcPr>
           <w:p>
             <w:pPr>
-              <w:spacing w:before="120" w:after="0" w:line="240" w:lineRule="auto"/>
+              <w:spacing w:after="0" w:line="240" w:lineRule="auto"/>
               <w:ind w:left="101" w:right="101"/>
               <w:rPr>
                 <w:rFonts w:ascii="Arial Narrow" w:hAnsi="Arial Narrow"/>
@@ -3967,18 +3739,6 @@
               </w:rPr>
               <w:t xml:space="preserve">           </w:t>
             </w:r>
-          </w:p>
-          <w:p>
-            <w:pPr>
-              <w:spacing w:after="0" w:line="240" w:lineRule="auto"/>
-              <w:ind w:left="106" w:right="106"/>
-              <w:jc w:val="center"/>
-              <w:rPr>
-                <w:rFonts w:ascii="Arial Narrow" w:hAnsi="Arial Narrow"/>
-                <w:sz w:val="6"/>
-                <w:szCs w:val="6"/>
-              </w:rPr>
-            </w:pPr>
           </w:p>
           <w:p>
             <w:pPr>
@@ -4141,7 +3901,7 @@
           </w:tcPr>
           <w:p>
             <w:pPr>
-              <w:spacing w:before="120" w:after="0" w:line="240" w:lineRule="auto"/>
+              <w:spacing w:after="0" w:line="240" w:lineRule="auto"/>
               <w:ind w:left="101" w:right="101"/>
               <w:rPr>
                 <w:rFonts w:ascii="Arial Narrow" w:hAnsi="Arial Narrow"/>
@@ -4173,18 +3933,6 @@
               </w:rPr>
               <w:t xml:space="preserve">           </w:t>
             </w:r>
-          </w:p>
-          <w:p>
-            <w:pPr>
-              <w:spacing w:after="0" w:line="240" w:lineRule="auto"/>
-              <w:ind w:left="106" w:right="106"/>
-              <w:jc w:val="center"/>
-              <w:rPr>
-                <w:rFonts w:ascii="Arial Narrow" w:hAnsi="Arial Narrow"/>
-                <w:sz w:val="6"/>
-                <w:szCs w:val="6"/>
-              </w:rPr>
-            </w:pPr>
           </w:p>
           <w:p>
             <w:pPr>
@@ -4330,7 +4078,7 @@
           </w:tcPr>
           <w:p>
             <w:pPr>
-              <w:spacing w:before="120" w:after="0" w:line="240" w:lineRule="auto"/>
+              <w:spacing w:after="0" w:line="240" w:lineRule="auto"/>
               <w:ind w:left="101" w:right="101"/>
               <w:rPr>
                 <w:rFonts w:ascii="Arial Narrow" w:hAnsi="Arial Narrow"/>
@@ -4362,18 +4110,6 @@
               </w:rPr>
               <w:t xml:space="preserve">           </w:t>
             </w:r>
-          </w:p>
-          <w:p>
-            <w:pPr>
-              <w:spacing w:after="0" w:line="240" w:lineRule="auto"/>
-              <w:ind w:left="106" w:right="106"/>
-              <w:jc w:val="center"/>
-              <w:rPr>
-                <w:rFonts w:ascii="Arial Narrow" w:hAnsi="Arial Narrow"/>
-                <w:sz w:val="6"/>
-                <w:szCs w:val="6"/>
-              </w:rPr>
-            </w:pPr>
           </w:p>
           <w:p>
             <w:pPr>
@@ -4536,7 +4272,7 @@
           </w:tcPr>
           <w:p>
             <w:pPr>
-              <w:spacing w:before="120" w:after="0" w:line="240" w:lineRule="auto"/>
+              <w:spacing w:after="0" w:line="240" w:lineRule="auto"/>
               <w:ind w:left="101" w:right="101"/>
               <w:rPr>
                 <w:rFonts w:ascii="Arial Narrow" w:hAnsi="Arial Narrow"/>
@@ -4568,18 +4304,6 @@
               </w:rPr>
               <w:t xml:space="preserve">           </w:t>
             </w:r>
-          </w:p>
-          <w:p>
-            <w:pPr>
-              <w:spacing w:after="0" w:line="240" w:lineRule="auto"/>
-              <w:ind w:left="106" w:right="106"/>
-              <w:jc w:val="center"/>
-              <w:rPr>
-                <w:rFonts w:ascii="Arial Narrow" w:hAnsi="Arial Narrow"/>
-                <w:sz w:val="6"/>
-                <w:szCs w:val="6"/>
-              </w:rPr>
-            </w:pPr>
           </w:p>
           <w:p>
             <w:pPr>
@@ -4742,7 +4466,7 @@
           </w:tcPr>
           <w:p>
             <w:pPr>
-              <w:spacing w:before="120" w:after="0" w:line="240" w:lineRule="auto"/>
+              <w:spacing w:after="0" w:line="240" w:lineRule="auto"/>
               <w:ind w:left="101" w:right="101"/>
               <w:rPr>
                 <w:rFonts w:ascii="Arial Narrow" w:hAnsi="Arial Narrow"/>
@@ -4774,18 +4498,6 @@
               </w:rPr>
               <w:t xml:space="preserve">           </w:t>
             </w:r>
-          </w:p>
-          <w:p>
-            <w:pPr>
-              <w:spacing w:after="0" w:line="240" w:lineRule="auto"/>
-              <w:ind w:left="106" w:right="106"/>
-              <w:jc w:val="center"/>
-              <w:rPr>
-                <w:rFonts w:ascii="Arial Narrow" w:hAnsi="Arial Narrow"/>
-                <w:sz w:val="6"/>
-                <w:szCs w:val="6"/>
-              </w:rPr>
-            </w:pPr>
           </w:p>
           <w:p>
             <w:pPr>
@@ -4931,7 +4643,7 @@
           </w:tcPr>
           <w:p>
             <w:pPr>
-              <w:spacing w:before="120" w:after="0" w:line="240" w:lineRule="auto"/>
+              <w:spacing w:after="0" w:line="240" w:lineRule="auto"/>
               <w:ind w:left="101" w:right="101"/>
               <w:rPr>
                 <w:rFonts w:ascii="Arial Narrow" w:hAnsi="Arial Narrow"/>
@@ -4963,18 +4675,6 @@
               </w:rPr>
               <w:t xml:space="preserve">           </w:t>
             </w:r>
-          </w:p>
-          <w:p>
-            <w:pPr>
-              <w:spacing w:after="0" w:line="240" w:lineRule="auto"/>
-              <w:ind w:left="106" w:right="106"/>
-              <w:jc w:val="center"/>
-              <w:rPr>
-                <w:rFonts w:ascii="Arial Narrow" w:hAnsi="Arial Narrow"/>
-                <w:sz w:val="6"/>
-                <w:szCs w:val="6"/>
-              </w:rPr>
-            </w:pPr>
           </w:p>
           <w:p>
             <w:pPr>
@@ -5137,7 +4837,7 @@
           </w:tcPr>
           <w:p>
             <w:pPr>
-              <w:spacing w:before="120" w:after="0" w:line="240" w:lineRule="auto"/>
+              <w:spacing w:after="0" w:line="240" w:lineRule="auto"/>
               <w:ind w:left="101" w:right="101"/>
               <w:rPr>
                 <w:rFonts w:ascii="Arial Narrow" w:hAnsi="Arial Narrow"/>
@@ -5169,18 +4869,6 @@
               </w:rPr>
               <w:t xml:space="preserve">           </w:t>
             </w:r>
-          </w:p>
-          <w:p>
-            <w:pPr>
-              <w:spacing w:after="0" w:line="240" w:lineRule="auto"/>
-              <w:ind w:left="106" w:right="106"/>
-              <w:jc w:val="center"/>
-              <w:rPr>
-                <w:rFonts w:ascii="Arial Narrow" w:hAnsi="Arial Narrow"/>
-                <w:sz w:val="6"/>
-                <w:szCs w:val="6"/>
-              </w:rPr>
-            </w:pPr>
           </w:p>
           <w:p>
             <w:pPr>
@@ -5343,7 +5031,7 @@
           </w:tcPr>
           <w:p>
             <w:pPr>
-              <w:spacing w:before="120" w:after="0" w:line="240" w:lineRule="auto"/>
+              <w:spacing w:after="0" w:line="240" w:lineRule="auto"/>
               <w:ind w:left="101" w:right="101"/>
               <w:rPr>
                 <w:rFonts w:ascii="Arial Narrow" w:hAnsi="Arial Narrow"/>
@@ -5375,18 +5063,6 @@
               </w:rPr>
               <w:t xml:space="preserve">           </w:t>
             </w:r>
-          </w:p>
-          <w:p>
-            <w:pPr>
-              <w:spacing w:after="0" w:line="240" w:lineRule="auto"/>
-              <w:ind w:left="106" w:right="106"/>
-              <w:jc w:val="center"/>
-              <w:rPr>
-                <w:rFonts w:ascii="Arial Narrow" w:hAnsi="Arial Narrow"/>
-                <w:sz w:val="6"/>
-                <w:szCs w:val="6"/>
-              </w:rPr>
-            </w:pPr>
           </w:p>
           <w:p>
             <w:pPr>
@@ -5532,7 +5208,7 @@
           </w:tcPr>
           <w:p>
             <w:pPr>
-              <w:spacing w:before="120" w:after="0" w:line="240" w:lineRule="auto"/>
+              <w:spacing w:after="0" w:line="240" w:lineRule="auto"/>
               <w:ind w:left="101" w:right="101"/>
               <w:rPr>
                 <w:rFonts w:ascii="Arial Narrow" w:hAnsi="Arial Narrow"/>
@@ -5564,18 +5240,6 @@
               </w:rPr>
               <w:t xml:space="preserve">           </w:t>
             </w:r>
-          </w:p>
-          <w:p>
-            <w:pPr>
-              <w:spacing w:after="0" w:line="240" w:lineRule="auto"/>
-              <w:ind w:left="106" w:right="106"/>
-              <w:jc w:val="center"/>
-              <w:rPr>
-                <w:rFonts w:ascii="Arial Narrow" w:hAnsi="Arial Narrow"/>
-                <w:sz w:val="6"/>
-                <w:szCs w:val="6"/>
-              </w:rPr>
-            </w:pPr>
           </w:p>
           <w:p>
             <w:pPr>
@@ -5738,7 +5402,7 @@
           </w:tcPr>
           <w:p>
             <w:pPr>
-              <w:spacing w:before="120" w:after="0" w:line="240" w:lineRule="auto"/>
+              <w:spacing w:after="0" w:line="240" w:lineRule="auto"/>
               <w:ind w:left="101" w:right="101"/>
               <w:rPr>
                 <w:rFonts w:ascii="Arial Narrow" w:hAnsi="Arial Narrow"/>
@@ -5770,18 +5434,6 @@
               </w:rPr>
               <w:t xml:space="preserve">           </w:t>
             </w:r>
-          </w:p>
-          <w:p>
-            <w:pPr>
-              <w:spacing w:after="0" w:line="240" w:lineRule="auto"/>
-              <w:ind w:left="106" w:right="106"/>
-              <w:jc w:val="center"/>
-              <w:rPr>
-                <w:rFonts w:ascii="Arial Narrow" w:hAnsi="Arial Narrow"/>
-                <w:sz w:val="6"/>
-                <w:szCs w:val="6"/>
-              </w:rPr>
-            </w:pPr>
           </w:p>
           <w:p>
             <w:pPr>
@@ -5944,7 +5596,7 @@
           </w:tcPr>
           <w:p>
             <w:pPr>
-              <w:spacing w:before="120" w:after="0" w:line="240" w:lineRule="auto"/>
+              <w:spacing w:after="0" w:line="240" w:lineRule="auto"/>
               <w:ind w:left="101" w:right="101"/>
               <w:rPr>
                 <w:rFonts w:ascii="Arial Narrow" w:hAnsi="Arial Narrow"/>
@@ -5976,18 +5628,6 @@
               </w:rPr>
               <w:t xml:space="preserve">           </w:t>
             </w:r>
-          </w:p>
-          <w:p>
-            <w:pPr>
-              <w:spacing w:after="0" w:line="240" w:lineRule="auto"/>
-              <w:ind w:left="106" w:right="106"/>
-              <w:jc w:val="center"/>
-              <w:rPr>
-                <w:rFonts w:ascii="Arial Narrow" w:hAnsi="Arial Narrow"/>
-                <w:sz w:val="6"/>
-                <w:szCs w:val="6"/>
-              </w:rPr>
-            </w:pPr>
           </w:p>
           <w:p>
             <w:pPr>

</xml_diff>